<commit_message>
Restore quota-carrying sales record and add per-role CRM to resume
Summary now leads with the sales-plus-CRM-builder blend as the
differentiator, backed by the Accelo top-three ranking and Fetch &
Funnel bookings that were previously trimmed. Each role now names
the CRM platform run there (HubSpot, Salesforce, GoHighLevel,
Accelo's own product), matching the corrected work history.
</commit_message>
<xml_diff>
--- a/applications/aurora-heavy-equipment-revops-manager/resume.docx
+++ b/applications/aurora-heavy-equipment-revops-manager/resume.docx
@@ -80,7 +80,7 @@
           <w:i w:val="0"/>
           <w:color w:val="1A1A1A"/>
         </w:rPr>
-        <w:t>Revenue operations leader and CRM architect with 15+ years in marketing and revenue operations, including 5+ years architecting CRM and marketing-automation systems (GoHighLevel primary, hands-on HubSpot builds) spanning workflow automation, pipeline management, data governance, and executive reporting. Built on a decade in client-facing sales and account roles selling and scoping CRM systems, where pipeline discipline and CRM adoption drove revenue. Comfortable owning a CRM environment end to end and turning it into a reliable operating system for sales and marketing.</w:t>
+        <w:t>Revenue operations leader and CRM architect who blends a decade of quota-carrying sales experience, including a top-three ranking on an 8-15 rep sales team, with 5+ years architecting CRM and marketing-automation systems across GoHighLevel, HubSpot, and Salesforce. That combination, having carried the pipeline and then built the systems behind it, is what makes CRM governance, workflow automation, and process changes actually stick with a sales team instead of getting ignored. Comfortable owning a CRM environment end to end and turning it into a reliable operating system for sales and marketing.</w:t>
       </w:r>
     </w:p>
     <w:p>
@@ -375,6 +375,30 @@
           <w:i w:val="0"/>
           <w:color w:val="1A1A1A"/>
         </w:rPr>
+        <w:t>Ran the sales pipeline in HubSpot end to end: deal stages, lead routing, required fields, and opportunity tracking.</w:t>
+      </w:r>
+    </w:p>
+    <w:p>
+      <w:pPr>
+        <w:spacing w:after="30"/>
+        <w:ind w:left="259" w:hanging="259"/>
+      </w:pPr>
+      <w:r>
+        <w:rPr>
+          <w:rFonts w:ascii="Times New Roman" w:hAnsi="Times New Roman"/>
+          <w:b w:val="0"/>
+          <w:i w:val="0"/>
+          <w:color w:val="1A1A1A"/>
+        </w:rPr>
+        <w:t xml:space="preserve">•  </w:t>
+      </w:r>
+      <w:r>
+        <w:rPr>
+          <w:rFonts w:ascii="Times New Roman" w:hAnsi="Times New Roman"/>
+          <w:b w:val="0"/>
+          <w:i w:val="0"/>
+          <w:color w:val="1A1A1A"/>
+        </w:rPr>
         <w:t>Managed integrated digital marketing strategies across inbound, paid media, and content, coordinating execution across internal departments.</w:t>
       </w:r>
     </w:p>
@@ -501,7 +525,7 @@
           <w:i w:val="0"/>
           <w:color w:val="1A1A1A"/>
         </w:rPr>
-        <w:t>Developed scalable communication workflows and automated product-training sequences that reduced onboarding friction across a partner network.</w:t>
+        <w:t>Developed scalable communication workflows and automated product-training sequences in Salesforce that reduced onboarding friction across a partner network.</w:t>
       </w:r>
     </w:p>
     <w:p>
@@ -675,6 +699,30 @@
           <w:i w:val="0"/>
           <w:color w:val="1A1A1A"/>
         </w:rPr>
+        <w:t>Closed 6 new-client deals during tenure, averaging ~$22K each (several exceeding $25K), roughly $130K+ in total bookings.</w:t>
+      </w:r>
+    </w:p>
+    <w:p>
+      <w:pPr>
+        <w:spacing w:after="30"/>
+        <w:ind w:left="259" w:hanging="259"/>
+      </w:pPr>
+      <w:r>
+        <w:rPr>
+          <w:rFonts w:ascii="Times New Roman" w:hAnsi="Times New Roman"/>
+          <w:b w:val="0"/>
+          <w:i w:val="0"/>
+          <w:color w:val="1A1A1A"/>
+        </w:rPr>
+        <w:t xml:space="preserve">•  </w:t>
+      </w:r>
+      <w:r>
+        <w:rPr>
+          <w:rFonts w:ascii="Times New Roman" w:hAnsi="Times New Roman"/>
+          <w:b w:val="0"/>
+          <w:i w:val="0"/>
+          <w:color w:val="1A1A1A"/>
+        </w:rPr>
         <w:t>Analyzed campaign performance data and translated results into optimization recommendations across paid media and creative.</w:t>
       </w:r>
     </w:p>
@@ -699,7 +747,7 @@
           <w:i w:val="0"/>
           <w:color w:val="1A1A1A"/>
         </w:rPr>
-        <w:t>Ran client accounts end to end, covering campaign execution, performance reporting, and cross-team communication.</w:t>
+        <w:t>Ran client accounts end to end in HubSpot, covering campaign execution, performance reporting, and cross-team communication.</w:t>
       </w:r>
     </w:p>
     <w:p>
@@ -849,7 +897,7 @@
           <w:i w:val="0"/>
           <w:color w:val="1A1A1A"/>
         </w:rPr>
-        <w:t>Onboarded and launched 25+ clients per month, holding 120% of sales targets and 110% of implementation targets.</w:t>
+        <w:t>Onboarded and launched 25+ clients per month in Salesforce, holding 120% of sales targets and 110% of implementation targets.</w:t>
       </w:r>
     </w:p>
     <w:p>
@@ -928,6 +976,30 @@
           <w:color w:val="1A1A1A"/>
         </w:rPr>
         <w:t>Sold and scoped complex CRM and project-management software to agencies and professional-services firms, with deep fluency in sales enablement, contact management, and pipeline automation.</w:t>
+      </w:r>
+    </w:p>
+    <w:p>
+      <w:pPr>
+        <w:spacing w:after="30"/>
+        <w:ind w:left="259" w:hanging="259"/>
+      </w:pPr>
+      <w:r>
+        <w:rPr>
+          <w:rFonts w:ascii="Times New Roman" w:hAnsi="Times New Roman"/>
+          <w:b w:val="0"/>
+          <w:i w:val="0"/>
+          <w:color w:val="1A1A1A"/>
+        </w:rPr>
+        <w:t xml:space="preserve">•  </w:t>
+      </w:r>
+      <w:r>
+        <w:rPr>
+          <w:rFonts w:ascii="Times New Roman" w:hAnsi="Times New Roman"/>
+          <w:b w:val="0"/>
+          <w:i w:val="0"/>
+          <w:color w:val="1A1A1A"/>
+        </w:rPr>
+        <w:t>Ranked top three in sales on a team of 8 to 15 reps for effectively the full tenure, sustained while quota roughly doubled.</w:t>
       </w:r>
     </w:p>
     <w:p>
@@ -1077,7 +1149,7 @@
           <w:i w:val="0"/>
           <w:color w:val="1A1A1A"/>
         </w:rPr>
-        <w:t>Ran full-cycle sales for a loyalty and marketing automation platform targeting SMBs, covering high-volume prospecting, lead qualification, and customer acquisition.</w:t>
+        <w:t>Ran full-cycle sales in Salesforce for a loyalty and marketing automation platform targeting SMBs, covering high-volume prospecting, lead qualification, and customer acquisition.</w:t>
       </w:r>
     </w:p>
     <w:p>
@@ -1143,7 +1215,7 @@
           <w:i w:val="0"/>
           <w:color w:val="1A1A1A"/>
         </w:rPr>
-        <w:t>GoHighLevel CRM &amp; Automation Architecture, HubSpot, Workflow Design &amp; Automation, Segmentation, Data Hygiene &amp; Governance, Lifecycle Stages, Lead Routing &amp; Assignment</w:t>
+        <w:t>GoHighLevel CRM &amp; Automation Architecture, HubSpot, Salesforce, Workflow Design &amp; Automation, Segmentation, Data Hygiene &amp; Governance, Lifecycle Stages, Lead Routing &amp; Assignment</w:t>
       </w:r>
     </w:p>
     <w:p>

</xml_diff>